<commit_message>
benerin isiform dan datadiri
</commit_message>
<xml_diff>
--- a/public/templates/Surat Pernyataan Hak Cipta 2021.docx
+++ b/public/templates/Surat Pernyataan Hak Cipta 2021.docx
@@ -62,7 +62,7 @@
               </wp:anchor>
             </w:drawing>
           </mc:Choice>
-          <mc:Fallback xmlns:sl="http://schemas.openxmlformats.org/schemaLibrary/2006/main" xmlns:a="http://schemas.openxmlformats.org/drawingml/2006/main" xmlns:pic="http://schemas.openxmlformats.org/drawingml/2006/picture" xmlns:c="http://schemas.openxmlformats.org/drawingml/2006/chart" xmlns:lc="http://schemas.openxmlformats.org/drawingml/2006/lockedCanvas" xmlns:dgm="http://schemas.openxmlformats.org/drawingml/2006/diagram" xmlns="http://schemas.microsoft.com/office/tasks/2019/documenttasks" xmlns:cr="http://schemas.microsoft.com/office/comments/2020/reactions">
+          <mc:Fallback xmlns:cr="http://schemas.microsoft.com/office/comments/2020/reactions" xmlns="http://schemas.microsoft.com/office/tasks/2019/documenttasks" xmlns:dgm="http://schemas.openxmlformats.org/drawingml/2006/diagram" xmlns:lc="http://schemas.openxmlformats.org/drawingml/2006/lockedCanvas" xmlns:c="http://schemas.openxmlformats.org/drawingml/2006/chart" xmlns:pic="http://schemas.openxmlformats.org/drawingml/2006/picture" xmlns:a="http://schemas.openxmlformats.org/drawingml/2006/main" xmlns:sl="http://schemas.openxmlformats.org/schemaLibrary/2006/main">
             <w:drawing>
               <wp:anchor allowOverlap="1" behindDoc="0" distB="0" distT="0" distL="114300" distR="114300" hidden="0" layoutInCell="1" locked="0" relativeHeight="0" simplePos="0">
                 <wp:simplePos x="0" y="0"/>
@@ -162,15 +162,7 @@
       </w:r>
       <w:proofErr w:type="spellEnd"/>
       <w:r>
-        <w:t xml:space="preserve"> </w:t>
-      </w:r>
-      <w:proofErr w:type="spellStart"/>
-      <w:r>
-        <w:t>hak</w:t>
-      </w:r>
-      <w:proofErr w:type="spellEnd"/>
-      <w:r>
-        <w:t xml:space="preserve"> </w:t>
+        <w:t xml:space="preserve"> hak </w:t>
       </w:r>
       <w:proofErr w:type="spellStart"/>
       <w:r>
@@ -377,14 +369,11 @@
         <w:t>:</w:t>
       </w:r>
       <w:r>
-        <w:t xml:space="preserve">  </w:t>
-      </w:r>
-      <w:r>
-        <w:t>${</w:t>
-      </w:r>
-      <w:proofErr w:type="spellStart"/>
-      <w:r>
-        <w:t>berjudul</w:t>
+        <w:t xml:space="preserve">  ${</w:t>
+      </w:r>
+      <w:proofErr w:type="spellStart"/>
+      <w:r>
+        <w:t>judul_ciptaan</w:t>
       </w:r>
       <w:proofErr w:type="spellEnd"/>
       <w:r>
@@ -392,9 +381,6 @@
       </w:r>
       <w:r>
         <w:t xml:space="preserve">       </w:t>
-      </w:r>
-      <w:r>
-        <w:tab/>
       </w:r>
       <w:r>
         <w:tab/>

</xml_diff>